<commit_message>
Add assignments_01 notebook and update class notebooks
</commit_message>
<xml_diff>
--- a/STATISTICS.docx
+++ b/STATISTICS.docx
@@ -852,9 +852,23 @@
         <w:rPr>
           <w:sz w:val="30"/>
           <w:szCs w:val="30"/>
+        </w:rPr>
+        <w:t>Population</w:t>
+      </w:r>
+      <w:r>
+        <w:rPr>
+          <w:sz w:val="30"/>
+          <w:szCs w:val="30"/>
           <w:u w:val="single"/>
         </w:rPr>
-        <w:t>Population Variance</w:t>
+        <w:t xml:space="preserve"> </w:t>
+      </w:r>
+      <w:r>
+        <w:rPr>
+          <w:sz w:val="30"/>
+          <w:szCs w:val="30"/>
+        </w:rPr>
+        <w:t>Variance</w:t>
       </w:r>
     </w:p>
     <w:p>
@@ -946,14 +960,12 @@
         <w:rPr>
           <w:sz w:val="30"/>
           <w:szCs w:val="30"/>
-          <w:u w:val="single"/>
-        </w:rPr>
-      </w:pPr>
-      <w:r>
-        <w:rPr>
-          <w:sz w:val="30"/>
-          <w:szCs w:val="30"/>
-          <w:u w:val="single"/>
+        </w:rPr>
+      </w:pPr>
+      <w:r>
+        <w:rPr>
+          <w:sz w:val="30"/>
+          <w:szCs w:val="30"/>
         </w:rPr>
         <w:t>Sample Variance</w:t>
       </w:r>
@@ -1069,14 +1081,12 @@
         <w:rPr>
           <w:sz w:val="30"/>
           <w:szCs w:val="30"/>
-          <w:u w:val="single"/>
-        </w:rPr>
-      </w:pPr>
-      <w:r>
-        <w:rPr>
-          <w:sz w:val="30"/>
-          <w:szCs w:val="30"/>
-          <w:u w:val="single"/>
+        </w:rPr>
+      </w:pPr>
+      <w:r>
+        <w:rPr>
+          <w:sz w:val="30"/>
+          <w:szCs w:val="30"/>
         </w:rPr>
         <w:t>Population std dev</w:t>
       </w:r>
@@ -1181,14 +1191,12 @@
         <w:rPr>
           <w:sz w:val="30"/>
           <w:szCs w:val="30"/>
-          <w:u w:val="single"/>
-        </w:rPr>
-      </w:pPr>
-      <w:r>
-        <w:rPr>
-          <w:sz w:val="30"/>
-          <w:szCs w:val="30"/>
-          <w:u w:val="single"/>
+        </w:rPr>
+      </w:pPr>
+      <w:r>
+        <w:rPr>
+          <w:sz w:val="30"/>
+          <w:szCs w:val="30"/>
         </w:rPr>
         <w:t>Sample std dev-</w:t>
       </w:r>
@@ -17093,6 +17101,7 @@
   <w:style w:type="character" w:default="1" w:styleId="DefaultParagraphFont">
     <w:name w:val="Default Paragraph Font"/>
     <w:uiPriority w:val="1"/>
+    <w:semiHidden/>
     <w:unhideWhenUsed/>
   </w:style>
   <w:style w:type="table" w:default="1" w:styleId="TableNormal">

</xml_diff>